<commit_message>
Add founding-FDE variant; expand graduate teaching across all resumes
</commit_message>
<xml_diff>
--- a/resume/daniel-yarmoluk-agentic-ai-architect.docx
+++ b/resume/daniel-yarmoluk-agentic-ai-architect.docx
@@ -698,7 +698,31 @@
         <w:rPr>
           <w:sz w:val="20"/>
         </w:rPr>
-        <w:t>- Teach a graduate course on production large language model (LLM) systems, agent orchestration design, knowledge graph infrastructure and enterprise AI evaluation.</w:t>
+        <w:t>- Eight years accelerating large language model (LLM) and knowledge graph capability for senior product and engineering leaders. Students are practicing technology executives and staff-level engineers who apply the material directly to live production initiatives at their own companies.</w:t>
+      </w:r>
+    </w:p>
+    <w:p>
+      <w:pPr>
+        <w:spacing w:after="30"/>
+        <w:ind w:left="259" w:hanging="259"/>
+      </w:pPr>
+      <w:r>
+        <w:rPr>
+          <w:sz w:val="20"/>
+        </w:rPr>
+        <w:t>- Designed and continually rewrite graduate curriculum spanning production LLM systems, agent orchestration design, knowledge graph infrastructure, enterprise AI evaluation, and digital transformation — updated each term as the capability frontier moves.</w:t>
+      </w:r>
+    </w:p>
+    <w:p>
+      <w:pPr>
+        <w:spacing w:after="30"/>
+        <w:ind w:left="259" w:hanging="259"/>
+      </w:pPr>
+      <w:r>
+        <w:rPr>
+          <w:sz w:val="20"/>
+        </w:rPr>
+        <w:t>- Enterprise AI adoption and enablement at leadership level: technical upskilling of senior technologists, change management, and closing the gap between what a system can do and what an organization will actually put into production.</w:t>
       </w:r>
     </w:p>
     <w:p>

</xml_diff>

<commit_message>
Add full-stack web section; drop unsupported TypeScript claim
</commit_message>
<xml_diff>
--- a/resume/daniel-yarmoluk-agentic-ai-architect.docx
+++ b/resume/daniel-yarmoluk-agentic-ai-architect.docx
@@ -220,7 +220,20 @@
           <w:i w:val="0"/>
           <w:sz w:val="20"/>
         </w:rPr>
-        <w:t>Languages, Platforms and Tooling: Python; TypeScript; JavaScript; SQL; asyncio; Starlette; FastAPI; Docker; Git; GitHub Actions; REST API design; microservices architecture; CI/CD pipelines (GitHub Actions, automated Docker image build and publish); OAuth and API key authentication; rate limiting and quota enforcement; secure and scalable service deployment; Amazon Web Services (AWS); Microsoft Azure; Google Cloud Platform (GCP); Render; Snowflake; Databricks; Anthropic Claude API; OpenAI API; PostHog product analytics; Stripe; pytest.</w:t>
+        <w:t>Full-Stack Web and Interfaces: Production JavaScript on both sides of the stack. Backend: serverless functions on Vercel — a JSON-RPC Model Context Protocol server implemented in JavaScript (initialize, tools/list, tools/call, API-key validation), a Stripe webhook handler with signature verification, license validation and graph-serving endpoints. Frontend: multi-page production sites deployed and live, with hand-written interactive graph visualizations — canvas and SVG rendering, requestAnimationFrame animation loops, drag, zoom, hover and selection state built directly rather than through a charting library. Responsive layout, CSS custom properties, light/dark theming, accessible semantic markup.</w:t>
+      </w:r>
+    </w:p>
+    <w:p>
+      <w:pPr>
+        <w:spacing w:after="40" w:before="0"/>
+      </w:pPr>
+      <w:r>
+        <w:rPr>
+          <w:b w:val="0"/>
+          <w:i w:val="0"/>
+          <w:sz w:val="20"/>
+        </w:rPr>
+        <w:t>Languages, Platforms and Tooling: Python; JavaScript; HTML; CSS; SQL; asyncio; Starlette; FastAPI; Docker; Git; GitHub Actions; REST API design; microservices architecture; CI/CD pipelines (GitHub Actions, automated Docker image build and publish); OAuth and API key authentication; rate limiting and quota enforcement; secure and scalable service deployment; Amazon Web Services (AWS); Microsoft Azure; Google Cloud Platform (GCP); Vercel; Render; Snowflake; Databricks; Anthropic Claude API; OpenAI API; PostHog product analytics; Stripe; pytest.</w:t>
       </w:r>
     </w:p>
     <w:p>

</xml_diff>

<commit_message>
Weave AI governance, data lineage and cloud AI platform coverage into all variants
</commit_message>
<xml_diff>
--- a/resume/daniel-yarmoluk-agentic-ai-architect.docx
+++ b/resume/daniel-yarmoluk-agentic-ai-architect.docx
@@ -169,6 +169,45 @@
           <w:sz w:val="20"/>
         </w:rPr>
         <w:t>Generative AI, Agents and Orchestration: Agentic AI architecture; autonomous agent design; multi-agent orchestration; agent-to-agent coordination; reasoning, planning and autonomous decision-making loops; tool and function calling; prompt engineering and context engineering; LangChain; LangGraph; AutoGen; CrewAI; Anthropic Claude; OpenAI; Azure OpenAI Service; Microsoft Azure AI; Microsoft Semantic Kernel; Google Gemini; xAI Grok; Perplexity; open-source models (Llama, Nemotron, Hugging Face); Claude Code (authored 84 skills, subagents, hooks and MCP integrations); agent governance, monitoring, latency and cost optimization.</w:t>
+      </w:r>
+    </w:p>
+    <w:p>
+      <w:pPr>
+        <w:spacing w:after="40" w:before="0"/>
+      </w:pPr>
+      <w:r>
+        <w:rPr>
+          <w:b w:val="0"/>
+          <w:i w:val="0"/>
+          <w:sz w:val="20"/>
+        </w:rPr>
+        <w:t>AI Governance, Risk and Assurance: Enterprise AI governance frameworks and standards; model risk management; model explainability and auditability; bias evaluation and mitigation; Responsible AI policy; production-readiness gates; regulatory, security and data-privacy compliance in regulated environments (HIPAA); AI technical due diligence for vendor, partnership and acquisition assessment; build-versus-buy evaluation across cost, performance, scalability and risk; reference architectures, design patterns and best-practice documentation; internal AI fluency and enablement programs.</w:t>
+      </w:r>
+    </w:p>
+    <w:p>
+      <w:pPr>
+        <w:spacing w:after="40" w:before="0"/>
+      </w:pPr>
+      <w:r>
+        <w:rPr>
+          <w:b w:val="0"/>
+          <w:i w:val="0"/>
+          <w:sz w:val="20"/>
+        </w:rPr>
+        <w:t>Enterprise Data Architecture and Lineage: Data governance; data lineage and provenance; access control and entitlement; data quality and availability for AI and machine learning initiatives; structured and unstructured data in AI systems; content-addressed source provenance (SHA-256 per node) with deterministic staleness detection; metadata and catalog platforms (DataHub, Microsoft Purview).</w:t>
+      </w:r>
+    </w:p>
+    <w:p>
+      <w:pPr>
+        <w:spacing w:after="40" w:before="0"/>
+      </w:pPr>
+      <w:r>
+        <w:rPr>
+          <w:b w:val="0"/>
+          <w:i w:val="0"/>
+          <w:sz w:val="20"/>
+        </w:rPr>
+        <w:t>Cloud AI Platforms: Azure OpenAI Service and Microsoft Azure AI; AWS SageMaker and AWS Bedrock; Google Vertex AI and Gemini; model selection frameworks and pragmatic build-versus-buy recommendations assessed on latency, cost, compliance fit and roadmap direction.</w:t>
       </w:r>
     </w:p>
     <w:p>
@@ -573,7 +612,19 @@
         <w:rPr>
           <w:sz w:val="20"/>
         </w:rPr>
-        <w:t>- Managed technical vendor relationships and platform integration across Anthropic, OpenAI, Azure OpenAI Service on Microsoft Azure AI, and AWS SageMaker.</w:t>
+        <w:t>- Managed technical vendor relationships and platform integration across Anthropic, OpenAI, Azure OpenAI Service on Microsoft Azure AI, and AWS SageMaker — owning technical due diligence and build-versus-buy recommendations assessed on latency, cost, compliance fit and roadmap.</w:t>
+      </w:r>
+    </w:p>
+    <w:p>
+      <w:pPr>
+        <w:spacing w:after="30"/>
+        <w:ind w:left="259" w:hanging="259"/>
+      </w:pPr>
+      <w:r>
+        <w:rPr>
+          <w:sz w:val="20"/>
+        </w:rPr>
+        <w:t>- Operated inside complex matrixed professional-services organizations, influencing architecture decisions across business lines without direct authority, and translating strategic priorities into actionable architecture with measurable business impact.</w:t>
       </w:r>
     </w:p>
     <w:p>
@@ -946,6 +997,7 @@
     </w:p>
     <w:p>
       <w:pPr>
+        <w:pageBreakBefore/>
         <w:spacing w:after="40" w:before="180"/>
       </w:pPr>
       <w:r>

</xml_diff>

<commit_message>
Add agent harness and runtime engineering vocabulary across all variants
</commit_message>
<xml_diff>
--- a/resume/daniel-yarmoluk-agentic-ai-architect.docx
+++ b/resume/daniel-yarmoluk-agentic-ai-architect.docx
@@ -181,7 +181,20 @@
           <w:i w:val="0"/>
           <w:sz w:val="20"/>
         </w:rPr>
-        <w:t>AI Governance, Risk and Assurance: Enterprise AI governance frameworks and standards; model risk management; model explainability and auditability; bias evaluation and mitigation; Responsible AI policy; production-readiness gates; regulatory, security and data-privacy compliance in regulated environments (HIPAA); AI technical due diligence for vendor, partnership and acquisition assessment; build-versus-buy evaluation across cost, performance, scalability and risk; reference architectures, design patterns and best-practice documentation; internal AI fluency and enablement programs.</w:t>
+        <w:t>Agent Harness and Runtime Engineering: Agent harness architecture — the runtime layer between a model and everything it acts on. Tool registration, discovery and lifecycle; tool and output schema design with validation at the boundary; context assembly and task-scoped context injection; multi-step orchestration and worker dispatch; capability and skill registries (84 authored, versioned, trigger-scoped skills); guardrails, entitlement gating, rate limiting and quota enforcement; retry, fallback and failure isolation; harness observability and structured telemetry; behavioral and retrieval evaluation harnesses; AgenticOps practice — versioning of prompts, models, tools and memory, automated testing before deploy, and rollback of agent capability.</w:t>
+      </w:r>
+    </w:p>
+    <w:p>
+      <w:pPr>
+        <w:spacing w:after="40" w:before="0"/>
+      </w:pPr>
+      <w:r>
+        <w:rPr>
+          <w:b w:val="0"/>
+          <w:i w:val="0"/>
+          <w:sz w:val="20"/>
+        </w:rPr>
+        <w:t>AI Governance, Risk and Assurance: Enterprise AI governance frameworks and standards; model risk management; model explainability and auditability; bias evaluation and mitigation; Responsible AI policy; production-readiness gates; regulatory, security and data-privacy compliance in regulated environments (HIPAA); AI technical due diligence for vendor, partnership and acquisition assessment; enterprise AI strategy definition; build-versus-buy evaluation across cost, performance, scalability and risk; reference architectures, design patterns and best practice documentation; internal AI fluency, talent development and enablement programs; emerging technology monitoring and competitive implications; regulatory, security and data privacy compliance; trade-off analysis across cost, performance, scalability and risk.</w:t>
       </w:r>
     </w:p>
     <w:p>
@@ -207,7 +220,7 @@
           <w:i w:val="0"/>
           <w:sz w:val="20"/>
         </w:rPr>
-        <w:t>Cloud AI Platforms: Azure OpenAI Service and Microsoft Azure AI; AWS SageMaker and AWS Bedrock; Google Vertex AI and Gemini; model selection frameworks and pragmatic build-versus-buy recommendations assessed on latency, cost, compliance fit and roadmap direction.</w:t>
+        <w:t>Cloud AI Platforms: Azure OpenAI Service and Microsoft Azure AI; AWS SageMaker and AWS Bedrock; Google Vertex AI and Gemini; model selection frameworks and pragmatic build-versus-buy recommendations assessed on latency, cost, compliance fit and roadmap direction; inference cost modelling and optimization.</w:t>
       </w:r>
     </w:p>
     <w:p>
@@ -323,6 +336,18 @@
           <w:sz w:val="20"/>
         </w:rPr>
         <w:t>Founder and Principal Engineer, AI Infrastructure | 04/2026 – Present</w:t>
+      </w:r>
+    </w:p>
+    <w:p>
+      <w:pPr>
+        <w:spacing w:after="30"/>
+        <w:ind w:left="259" w:hanging="259"/>
+      </w:pPr>
+      <w:r>
+        <w:rPr>
+          <w:sz w:val="20"/>
+        </w:rPr>
+        <w:t>- Design and build the agent harness: tool registration and discovery, output schema validation, task-scoped context assembly, orchestration and worker dispatch, guardrails and entitlement gating, retry and fallback, and harness-level observability.</w:t>
       </w:r>
     </w:p>
     <w:p>
@@ -624,7 +649,7 @@
         <w:rPr>
           <w:sz w:val="20"/>
         </w:rPr>
-        <w:t>- Operated inside complex matrixed professional-services organizations, influencing architecture decisions across business lines without direct authority, and translating strategic priorities into actionable architecture with measurable business impact.</w:t>
+        <w:t>- Operated inside complex, matrixed professional services organizations serving financial services, healthcare and regulated clients — able to influence architecture decisions across business lines without direct authority, and to translate strategic priorities into actionable architecture decisions with measurable business impact. Recognized internally as a technical authority and thought leader on enterprise AI.</w:t>
       </w:r>
     </w:p>
     <w:p>

</xml_diff>